<commit_message>
Printed rules: Q1 and Q11 in the rulebook, quick reference and study packet
The table game and the app agree again (FINDINGS #105). Seven wordings,
as proposed: Neutralise may try Sleeping sickness, whose coat changes on
1 to 3; no vaccine against a venom; an antivenom kill leaves no memory.
Each edit is one paragraph; every other part of each file is byte for
byte unchanged, and the why boxes still match the rulebook word for word.

The equivalence suite reads the rulebook, the reachability report and
the original engine from outside its package, and turbo's hash could not
see them: a changed rulebook replayed a cached green (FINDINGS #108).
tests/equivalence/turbo.json declares them, and turbo:check asserts they
are in the hash; seen failing without the rulebook.

Co-Authored-By: Claude Opus 5.5 <noreply@anthropic.com>
</commit_message>
<xml_diff>
--- a/docs/Immunity_Wars_Rulebook_v3_1.docx
+++ b/docs/Immunity_Wars_Rulebook_v3_1.docx
@@ -4416,7 +4416,7 @@
                 <w:sz w:val="18"/>
                 <w:szCs w:val="18"/>
               </w:rPr>
-              <w:t xml:space="preserve">Spend one matching cube to destroy a virus, a toxin, or travelling/blood-stage malaria anywhere on the board.</w:t>
+              <w:t xml:space="preserve">Spend one matching cube to destroy a virus, a toxin, or travelling/blood-stage malaria anywhere on the board. Against Sleeping sickness, roll the die: on 1 to 3 it changes its coat, the cube is lost and it lives; on 4 to 6 it is destroyed.</w:t>
             </w:r>
           </w:p>
         </w:tc>
@@ -4582,7 +4582,7 @@
                 <w:sz w:val="18"/>
                 <w:szCs w:val="18"/>
               </w:rPr>
-              <w:t xml:space="preserve"> of it.</w:t>
+              <w:t xml:space="preserve"> of it. Never against a venom: it acts in minutes, and even a remembered response takes days, so only antivenom works.</w:t>
             </w:r>
           </w:p>
         </w:tc>
@@ -8230,7 +8230,7 @@
                 <w:sz w:val="18"/>
                 <w:szCs w:val="18"/>
               </w:rPr>
-              <w:t xml:space="preserve"> Beat a pathogen and your body remembers it. Vaccination is switched off.</w:t>
+              <w:t xml:space="preserve"> Beat a pathogen and your body remembers it, but never a venom: antivenom teaches it nothing. Vaccination is switched off.</w:t>
             </w:r>
           </w:p>
         </w:tc>

</xml_diff>